<commit_message>
Update manuscript figures and add failure-analysis visualizations
</commit_message>
<xml_diff>
--- a/manuscript/manuscript_narrative/original_layout/Galaxy_agents_original_layout_manuscript.docx
+++ b/manuscript/manuscript_narrative/original_layout/Galaxy_agents_original_layout_manuscript.docx
@@ -85,7 +85,7 @@
           <w:sz w:val="20"/>
           <w:szCs w:val="20"/>
         </w:rPr>
-        <w:t xml:space="preserve">Word counts: abstract 69; main text 1005; figure legends 298; main-text references 224 (11 references); total 1596. Methods 2383 (5 further references). Display items: 2 figures. Supplementary Information: 11 Supplementary Figures, 6 Supplementary Tables and 3 Supplementary Notes; Supplementary Data 1 and 2; Source Data for Figs. 1 and 2.</w:t>
+        <w:t xml:space="preserve">Word counts: abstract 69; main text 1007; figure legends 271; main-text references 224 (11 references); total 1571. Methods 2383 (5 further references). Display items: 2 figures. Supplementary Information: 11 Supplementary Figures, 6 Supplementary Tables and 3 Supplementary Notes; Supplementary Data 1 and 2; Source Data for Figs. 1 and 2.</w:t>
       </w:r>
     </w:p>
     <w:p>
@@ -286,7 +286,7 @@
         <w:rPr>
           <w:rFonts w:ascii="Arial" w:cs="Arial" w:eastAsia="Arial" w:hAnsi="Arial"/>
         </w:rPr>
-        <w:t xml:space="preserve">Next, we asked why runs failed. An audit of the execution traces of all 151 incorrect BixBench-Verified-50 runs found that Galaxy itself caused 3 failures (Fig. 2a). Most failures, 107 (71%), came from the benchmark: an under-specified task or reference answer (94) or a scorer that rejected a valid answer (13). The agent caused 37, and 4 runs submitted no answer. The two main causes were linked, because in 74 of the 94 under-specified runs the agent also did not validate its answer. Under-specification was systematic: 85 of the 94 runs were in replicate groups in which all three runs were wrong. In contrast, missing validation, the main agent-side cause, was largely random: 16 of its 32 cases occurred in groups whose other two replicates were correct. Notably, at least one replicate was correct in 85–94% of replicate groups, yet a majority vote added at most 2.3 points (Supplementary Fig. 4 and Supplementary Table 1). Thus, a validation step that selects a correct replicate could recover more errors than voting.</w:t>
+        <w:t xml:space="preserve">Next, we asked why runs failed. An audit of the execution traces of all 151 incorrect BixBench-Verified-50 runs found that Galaxy itself caused 3 failures (Fig. 2a). Most failures, 107 (71%), came from the benchmark: an under-specified task or reference answer (94) or a scorer that rejected a valid answer (13). The agent caused 37, and 4 runs submitted no answer. The two main causes were linked, because in 74 of the 94 under-specified runs the agent also did not validate its answer. Under-specification was systematic: 85 of the 94 runs were in replicate groups in which all three runs were wrong. In contrast, missing validation, the main agent-side cause, was largely random: 16 of its 32 cases occurred in groups whose other two replicates were correct. Notably, at least one replicate was correct in 85–94% of replicate groups, yet a majority vote added at most 2.3 points (Fig. 2b, Supplementary Fig. 4 and Supplementary Table 1). Thus, a validation step that selects a correct replicate could recover more errors than voting.</w:t>
       </w:r>
     </w:p>
     <w:p>
@@ -298,7 +298,7 @@
         <w:rPr>
           <w:rFonts w:ascii="Arial" w:cs="Arial" w:eastAsia="Arial" w:hAnsi="Arial"/>
         </w:rPr>
-        <w:t xml:space="preserve">Galaxy also recorded each analysis in a structured form that can be audited (Fig. 2b and Supplementary Fig. 5). All 37,498 analysis steps in Galaxy runs recorded the tool and its version, the parameters and the output datasets, and the Galaxy history was retrieved for 1,871 of 1,908 runs. In contrast, custom-code runs retained the 55,380 commands that they ran but no structured record of software versions, parameters or outputs. This record came at a cost: across the main runs, Galaxy used 4.2, 2.7 and 0.92 times the tokens of custom code on BixBench-Verified-50, CompBioBench and the IWC-derived tasks (Supplementary Table 2 and Supplementary Fig. 6). Agent traces showed that, in the first-round GPT-5.5 batch, Galaxy runs took 2.66 times as many steps as custom-code runs, and each step reread 2.2 times as much context (Methods). Treating the agents as virtual users, we changed the interface to reduce these overheads and reran BixBench-Verified-50 (Fig. 2c). Combining job submission, waiting and checking into one MCP call, among other changes, reduced Galaxy tokens by 55.2% (95% CI 44.9–62.8%) with GPT-5.5. Compact replies and longer waits between checks reduced them by a further 55.6% (46.4–63.0%) with GPT-5.6 Sol, to 1.53 times custom code, while 137 of 150 runs remained correct (136 before). Thus, much of Galaxy's token cost came from its interface, and agent traces showed how to reduce it.</w:t>
+        <w:t xml:space="preserve">Galaxy also recorded each analysis in a structured form that can be audited (Fig. 2c and Supplementary Fig. 5). All 37,498 analysis steps in Galaxy runs recorded the tool and its version, the parameters and the output datasets, and the Galaxy history was retrieved for 1,871 of 1,908 runs. In contrast, custom-code runs retained the 55,380 commands that they ran but no structured record of software versions, parameters or outputs. This record came at a cost: across the main runs, Galaxy used 4.2, 2.7 and 0.92 times the tokens of custom code on BixBench-Verified-50, CompBioBench and the IWC-derived tasks (Supplementary Table 2 and Supplementary Fig. 6). Agent traces showed that, in the first-round GPT-5.5 batch, Galaxy runs took 2.66 times as many steps as custom-code runs, and each step reread 2.2 times as much context (Methods). Treating the agents as virtual users, we changed the interface to reduce these overheads and reran BixBench-Verified-50 (Fig. 2d). Combining job submission, waiting and checking into one MCP call, among other changes, reduced Galaxy tokens by 55.2% (95% CI 44.9–62.8%) with GPT-5.5. Compact replies and longer waits between checks reduced them by a further 55.6% (46.4–63.0%) with GPT-5.6 Sol, to 1.53 times custom code, while 137 of 150 runs remained correct (136 before). Thus, much of Galaxy's token cost came from its interface, and agent traces showed how to reduce it.</w:t>
       </w:r>
     </w:p>
     <w:p>
@@ -1416,7 +1416,7 @@
         <w:rPr>
           <w:rFonts w:ascii="Arial" w:cs="Arial" w:eastAsia="Arial" w:hAnsi="Arial"/>
         </w:rPr>
-        <w:t xml:space="preserve">Supplementary Data 2 lists every run with links to its agent trace, its page on the results site (https://goeckslab.github.io/galaxy-agent-benchmark/) and, for Galaxy runs, its usegalaxy.org history: the 3,840 primary runs, the 77 runs replaced by reruns and the 450 interface-round runs of Fig. 2c. The agent traces of both conditions, with prompts, submitted answers, token usage and evaluation records, are in the Hugging Face dataset goeckslab/galaxy-agent-benchmark-run-traces </w:t>
+        <w:t xml:space="preserve">Supplementary Data 2 lists every run with links to its agent trace, its page on the results site (https://goeckslab.github.io/galaxy-agent-benchmark/) and, for Galaxy runs, its usegalaxy.org history: the 3,840 primary runs, the 77 runs replaced by reruns and the 450 interface-round runs of Fig. 2d. The agent traces of both conditions, with prompts, submitted answers, token usage and evaluation records, are in the Hugging Face dataset goeckslab/galaxy-agent-benchmark-run-traces </w:t>
       </w:r>
       <w:r>
         <w:rPr>
@@ -1960,7 +1960,7 @@
         <w:rPr>
           <w:rFonts w:ascii="Arial" w:cs="Arial" w:eastAsia="Arial" w:hAnsi="Arial"/>
         </w:rPr>
-        <w:t xml:space="preserve">, Study design: each of four model configurations attempted each of 160 tasks three times with Galaxy and with custom code. </w:t>
+        <w:t xml:space="preserve">, Study design: four model configurations attempted each of 160 tasks three times in each condition. </w:t>
       </w:r>
       <w:r>
         <w:rPr>
@@ -1988,7 +1988,7 @@
         <w:rPr>
           <w:rFonts w:ascii="Arial" w:cs="Arial" w:eastAsia="Arial" w:hAnsi="Arial"/>
         </w:rPr>
-        <w:t xml:space="preserve">, Galaxy minus custom code for each model (open circles) and for the four models pooled (filled diamonds) on BixBench-Verified-50 (</w:t>
+        <w:t xml:space="preserve">, Galaxy minus custom code for each model (open circles) and pooled (filled diamonds) on BixBench-Verified-50 (</w:t>
       </w:r>
       <w:r>
         <w:rPr>
@@ -2016,7 +2016,7 @@
         <w:rPr>
           <w:rFonts w:ascii="Arial" w:cs="Arial" w:eastAsia="Arial" w:hAnsi="Arial"/>
         </w:rPr>
-        <w:t xml:space="preserve">; runs agreeing with the answer key) and the IWC-derived tasks (</w:t>
+        <w:t xml:space="preserve">; agreement with the answer key) and the IWC-derived tasks (</w:t>
       </w:r>
       <w:r>
         <w:rPr>
@@ -2030,35 +2030,7 @@
         <w:rPr>
           <w:rFonts w:ascii="Arial" w:cs="Arial" w:eastAsia="Arial" w:hAnsi="Arial"/>
         </w:rPr>
-        <w:t xml:space="preserve">; mean output agreement); condition means are given above each panel. Grey bands in </w:t>
-      </w:r>
-      <w:r>
-        <w:rPr>
-          <w:rFonts w:ascii="Arial" w:cs="Arial" w:eastAsia="Arial" w:hAnsi="Arial"/>
-          <w:b/>
-          <w:bCs/>
-        </w:rPr>
-        <w:t xml:space="preserve">b</w:t>
-      </w:r>
-      <w:r>
-        <w:rPr>
-          <w:rFonts w:ascii="Arial" w:cs="Arial" w:eastAsia="Arial" w:hAnsi="Arial"/>
-        </w:rPr>
-        <w:t xml:space="preserve"> and </w:t>
-      </w:r>
-      <w:r>
-        <w:rPr>
-          <w:rFonts w:ascii="Arial" w:cs="Arial" w:eastAsia="Arial" w:hAnsi="Arial"/>
-          <w:b/>
-          <w:bCs/>
-        </w:rPr>
-        <w:t xml:space="preserve">c</w:t>
-      </w:r>
-      <w:r>
-        <w:rPr>
-          <w:rFonts w:ascii="Arial" w:cs="Arial" w:eastAsia="Arial" w:hAnsi="Arial"/>
-        </w:rPr>
-        <w:t xml:space="preserve"> mark ±5 percentage points. Error bars, 95% cluster-bootstrap CIs (20,000 resamples; clusters are BixBench source capsules or tasks); </w:t>
+        <w:t xml:space="preserve">; mean output agreement); condition values above each panel. Grey bands, ±5 percentage points. Error bars, 95% cluster-bootstrap CIs (clusters: BixBench source capsules or tasks); </w:t>
       </w:r>
       <w:r>
         <w:rPr>
@@ -2114,7 +2086,7 @@
         <w:rPr>
           <w:rFonts w:ascii="Arial" w:cs="Arial" w:eastAsia="Arial" w:hAnsi="Arial"/>
         </w:rPr>
-        <w:t xml:space="preserve">) runs per model and condition. With ten IWC-derived tasks the bootstrap interval is too narrow; the exact paired </w:t>
+        <w:t xml:space="preserve">) runs per model and condition. With ten IWC-derived tasks the interval is too narrow; the exact paired </w:t>
       </w:r>
       <w:r>
         <w:rPr>
@@ -2128,7 +2100,7 @@
         <w:rPr>
           <w:rFonts w:ascii="Arial" w:cs="Arial" w:eastAsia="Arial" w:hAnsi="Arial"/>
         </w:rPr>
-        <w:t xml:space="preserve"> for the pooled difference is 0.055.</w:t>
+        <w:t xml:space="preserve"> of the pooled difference is 0.055.</w:t>
       </w:r>
     </w:p>
     <w:p>
@@ -2144,9 +2116,9 @@
       <w:r>
         <w:drawing>
           <wp:inline distT="0" distB="0" distL="0" distR="0">
-            <wp:extent cx="5724525" cy="2286000"/>
+            <wp:extent cx="5724525" cy="4067175"/>
             <wp:effectExtent t="0" r="0" b="0" l="0"/>
-            <wp:docPr id="1" name="Fig2_300dpi.png" descr="Fig. 2 | Most failures came from the benchmark, Galaxy recorded every analysis step, and interface changes reduced Galaxy's token use." title="Fig. 2 | Most failures came from the benchmark, Galaxy recorded every analysis step, and interface changes reduced Galaxy's token use."/>
+            <wp:docPr id="1" name="Fig2_300dpi.png" descr="Fig. 2 | Most errors came from the benchmark, voting recovered few of them, and interface changes reduced Galaxy's token use." title="Fig. 2 | Most errors came from the benchmark, voting recovered few of them, and interface changes reduced Galaxy's token use."/>
             <wp:cNvGraphicFramePr>
               <a:graphicFrameLocks xmlns:a="http://schemas.openxmlformats.org/drawingml/2006/main" noChangeAspect="1"/>
             </wp:cNvGraphicFramePr>
@@ -2169,7 +2141,7 @@
                   <pic:spPr bwMode="auto">
                     <a:xfrm>
                       <a:off x="0" y="0"/>
-                      <a:ext cx="5724525" cy="2286000"/>
+                      <a:ext cx="5724525" cy="4067175"/>
                     </a:xfrm>
                     <a:prstGeom prst="rect">
                       <a:avLst/>
@@ -2192,7 +2164,7 @@
           <w:b/>
           <w:bCs/>
         </w:rPr>
-        <w:t xml:space="preserve">Fig. 2 | Most failures came from the benchmark, Galaxy recorded every analysis step, and interface changes reduced Galaxy's token use.</w:t>
+        <w:t xml:space="preserve">Fig. 2 | Most errors came from the benchmark, voting recovered few of them, and interface changes reduced Galaxy's token use.</w:t>
       </w:r>
       <w:r>
         <w:rPr>
@@ -2212,7 +2184,7 @@
         <w:rPr>
           <w:rFonts w:ascii="Arial" w:cs="Arial" w:eastAsia="Arial" w:hAnsi="Arial"/>
         </w:rPr>
-        <w:t xml:space="preserve">, Primary causes of the 151 incorrect BixBench-Verified-50 runs (both conditions), assigned from execution traces, by the number of correct sibling replicates (the other two runs of the same task, model and condition). </w:t>
+        <w:t xml:space="preserve">, Primary causes of the 151 incorrect BixBench-Verified-50 runs (both conditions), from execution traces, by the number of correct sibling replicates (the other two runs of the same task, model and condition). </w:t>
       </w:r>
       <w:r>
         <w:rPr>
@@ -2226,35 +2198,7 @@
         <w:rPr>
           <w:rFonts w:ascii="Arial" w:cs="Arial" w:eastAsia="Arial" w:hAnsi="Arial"/>
         </w:rPr>
-        <w:t xml:space="preserve">, Percentage of analysis steps for which the archive retains each element: Galaxy jobs (</w:t>
-      </w:r>
-      <w:r>
-        <w:rPr>
-          <w:rFonts w:ascii="Arial" w:cs="Arial" w:eastAsia="Arial" w:hAnsi="Arial"/>
-          <w:i/>
-          <w:iCs/>
-        </w:rPr>
-        <w:t xml:space="preserve">n</w:t>
-      </w:r>
-      <w:r>
-        <w:rPr>
-          <w:rFonts w:ascii="Arial" w:cs="Arial" w:eastAsia="Arial" w:hAnsi="Arial"/>
-        </w:rPr>
-        <w:t xml:space="preserve"> = 37,498 steps) and custom-code analysis commands (</w:t>
-      </w:r>
-      <w:r>
-        <w:rPr>
-          <w:rFonts w:ascii="Arial" w:cs="Arial" w:eastAsia="Arial" w:hAnsi="Arial"/>
-          <w:i/>
-          <w:iCs/>
-        </w:rPr>
-        <w:t xml:space="preserve">n</w:t>
-      </w:r>
-      <w:r>
-        <w:rPr>
-          <w:rFonts w:ascii="Arial" w:cs="Arial" w:eastAsia="Arial" w:hAnsi="Arial"/>
-        </w:rPr>
-        <w:t xml:space="preserve"> = 55,380 steps). </w:t>
+        <w:t xml:space="preserve">, Accuracy of a single run, a majority of 3 replicates, a majority of all 12 runs of a task and at least 1 of 3 correct (the ceiling for selecting a correct replicate), four models pooled; IWC-derived runs are correct at output agreement ≥ 0.99. A vote on the submitted answers is in Supplementary Table 1. </w:t>
       </w:r>
       <w:r>
         <w:rPr>
@@ -2268,7 +2212,21 @@
         <w:rPr>
           <w:rFonts w:ascii="Arial" w:cs="Arial" w:eastAsia="Arial" w:hAnsi="Arial"/>
         </w:rPr>
-        <w:t xml:space="preserve">, Tokens (input including cached context, plus output) per complete 50-task BixBench-Verified-50 run for custom code (vermillion) and Galaxy (blue), across rounds of interface changes with GPT-5.5 (July 2026) and GPT-5.6 Sol (October 2026). Numbers above bars, Galaxy ÷ custom code; numbers in bars, Galaxy runs correct. Brackets, change in Galaxy tokens from the first to the last stage (paired by task; 95% cluster-bootstrap CIs). Round 3 without longer waits was run once over the 50 tasks; the other stages have three runs per task.</w:t>
+        <w:t xml:space="preserve">, One analysis step as recorded by the Galaxy job and by the custom-code trace; both runs answered correctly. </w:t>
+      </w:r>
+      <w:r>
+        <w:rPr>
+          <w:rFonts w:ascii="Arial" w:cs="Arial" w:eastAsia="Arial" w:hAnsi="Arial"/>
+          <w:b/>
+          <w:bCs/>
+        </w:rPr>
+        <w:t xml:space="preserve">d</w:t>
+      </w:r>
+      <w:r>
+        <w:rPr>
+          <w:rFonts w:ascii="Arial" w:cs="Arial" w:eastAsia="Arial" w:hAnsi="Arial"/>
+        </w:rPr>
+        <w:t xml:space="preserve">, Galaxy ÷ custom-code tokens per 50-task BixBench-Verified-50 run across interface rounds, with the percentage of Galaxy runs correct. Error bars, 95% cluster-bootstrap CIs; open circle, a single replicate.</w:t>
       </w:r>
     </w:p>
     <w:sectPr>

</xml_diff>